<commit_message>
Updated docs and worked with Streams, July 30th
</commit_message>
<xml_diff>
--- a/flutter_more_documents/f34_provider_state_management_flutter.docx
+++ b/flutter_more_documents/f34_provider_state_management_flutter.docx
@@ -948,7 +948,14 @@
           <w:sz w:val="32"/>
           <w:szCs w:val="32"/>
         </w:rPr>
-        <w:t>……………………………42</w:t>
+        <w:t>……………………………4</w:t>
+      </w:r>
+      <w:r>
+        <w:rPr>
+          <w:sz w:val="32"/>
+          <w:szCs w:val="32"/>
+        </w:rPr>
+        <w:t>4</w:t>
       </w:r>
     </w:p>
     <w:p>
@@ -985,7 +992,14 @@
           <w:sz w:val="32"/>
           <w:szCs w:val="32"/>
         </w:rPr>
-        <w:t>……………….42</w:t>
+        <w:t>……………….4</w:t>
+      </w:r>
+      <w:r>
+        <w:rPr>
+          <w:sz w:val="32"/>
+          <w:szCs w:val="32"/>
+        </w:rPr>
+        <w:t>4</w:t>
       </w:r>
     </w:p>
     <w:p>
@@ -34029,7 +34043,34 @@
           <w:sz w:val="32"/>
           <w:szCs w:val="32"/>
         </w:rPr>
-        <w:t xml:space="preserve"> in main)</w:t>
+        <w:t xml:space="preserve"> in </w:t>
+      </w:r>
+      <w:proofErr w:type="spellStart"/>
+      <w:r>
+        <w:rPr>
+          <w:b/>
+          <w:bCs/>
+          <w:sz w:val="32"/>
+          <w:szCs w:val="32"/>
+        </w:rPr>
+        <w:t>main</w:t>
+      </w:r>
+      <w:r>
+        <w:rPr>
+          <w:b/>
+          <w:bCs/>
+          <w:sz w:val="32"/>
+          <w:szCs w:val="32"/>
+        </w:rPr>
+        <w:t>.dart</w:t>
+      </w:r>
+      <w:proofErr w:type="spellEnd"/>
+      <w:r>
+        <w:rPr>
+          <w:sz w:val="32"/>
+          <w:szCs w:val="32"/>
+        </w:rPr>
+        <w:t>)</w:t>
       </w:r>
     </w:p>
     <w:p>
@@ -34354,9 +34395,183 @@
           <w:sz w:val="32"/>
           <w:szCs w:val="32"/>
         </w:rPr>
+        <w:t xml:space="preserve">    // Accessing context in dispose is dangerous, so </w:t>
+      </w:r>
+      <w:proofErr w:type="spellStart"/>
+      <w:r>
+        <w:rPr>
+          <w:b/>
+          <w:bCs/>
+          <w:color w:val="D86DCB" w:themeColor="accent5" w:themeTint="99"/>
+          <w:sz w:val="32"/>
+          <w:szCs w:val="32"/>
+        </w:rPr>
+        <w:t>ChangeNotifierProvider.value</w:t>
+      </w:r>
+      <w:proofErr w:type="spellEnd"/>
+      <w:r>
+        <w:rPr>
+          <w:b/>
+          <w:bCs/>
+          <w:color w:val="D86DCB" w:themeColor="accent5" w:themeTint="99"/>
+          <w:sz w:val="32"/>
+          <w:szCs w:val="32"/>
+        </w:rPr>
+        <w:t xml:space="preserve"> is used see above</w:t>
+      </w:r>
+    </w:p>
+    <w:p>
+      <w:pPr>
+        <w:jc w:val="both"/>
+        <w:rPr>
+          <w:b/>
+          <w:bCs/>
+          <w:color w:val="D86DCB" w:themeColor="accent5" w:themeTint="99"/>
+          <w:sz w:val="32"/>
+          <w:szCs w:val="32"/>
+        </w:rPr>
+      </w:pPr>
+      <w:r>
+        <w:rPr>
+          <w:b/>
+          <w:bCs/>
+          <w:color w:val="D86DCB" w:themeColor="accent5" w:themeTint="99"/>
+          <w:sz w:val="32"/>
+          <w:szCs w:val="32"/>
+        </w:rPr>
         <w:t xml:space="preserve">    </w:t>
       </w:r>
       <w:proofErr w:type="spellStart"/>
+      <w:r>
+        <w:rPr>
+          <w:b/>
+          <w:bCs/>
+          <w:color w:val="D86DCB" w:themeColor="accent5" w:themeTint="99"/>
+          <w:sz w:val="32"/>
+          <w:szCs w:val="32"/>
+        </w:rPr>
+        <w:t>locationProvider</w:t>
+      </w:r>
+      <w:r>
+        <w:rPr>
+          <w:b/>
+          <w:bCs/>
+          <w:color w:val="D86DCB" w:themeColor="accent5" w:themeTint="99"/>
+          <w:sz w:val="32"/>
+          <w:szCs w:val="32"/>
+        </w:rPr>
+        <w:t>.stopListening</w:t>
+      </w:r>
+      <w:proofErr w:type="spellEnd"/>
+      <w:r>
+        <w:rPr>
+          <w:b/>
+          <w:bCs/>
+          <w:color w:val="D86DCB" w:themeColor="accent5" w:themeTint="99"/>
+          <w:sz w:val="32"/>
+          <w:szCs w:val="32"/>
+        </w:rPr>
+        <w:t>();</w:t>
+      </w:r>
+    </w:p>
+    <w:p>
+      <w:pPr>
+        <w:jc w:val="both"/>
+        <w:rPr>
+          <w:b/>
+          <w:bCs/>
+          <w:color w:val="D86DCB" w:themeColor="accent5" w:themeTint="99"/>
+          <w:sz w:val="32"/>
+          <w:szCs w:val="32"/>
+        </w:rPr>
+      </w:pPr>
+      <w:r>
+        <w:rPr>
+          <w:b/>
+          <w:bCs/>
+          <w:color w:val="D86DCB" w:themeColor="accent5" w:themeTint="99"/>
+          <w:sz w:val="32"/>
+          <w:szCs w:val="32"/>
+        </w:rPr>
+        <w:t xml:space="preserve">    // Or</w:t>
+      </w:r>
+    </w:p>
+    <w:p>
+      <w:pPr>
+        <w:jc w:val="both"/>
+        <w:rPr>
+          <w:b/>
+          <w:bCs/>
+          <w:color w:val="D86DCB" w:themeColor="accent5" w:themeTint="99"/>
+          <w:sz w:val="32"/>
+          <w:szCs w:val="32"/>
+        </w:rPr>
+      </w:pPr>
+      <w:r>
+        <w:rPr>
+          <w:b/>
+          <w:bCs/>
+          <w:color w:val="D86DCB" w:themeColor="accent5" w:themeTint="99"/>
+          <w:sz w:val="32"/>
+          <w:szCs w:val="32"/>
+        </w:rPr>
+        <w:t xml:space="preserve">    </w:t>
+      </w:r>
+      <w:proofErr w:type="spellStart"/>
+      <w:r>
+        <w:rPr>
+          <w:b/>
+          <w:bCs/>
+          <w:color w:val="D86DCB" w:themeColor="accent5" w:themeTint="99"/>
+          <w:sz w:val="32"/>
+          <w:szCs w:val="32"/>
+        </w:rPr>
+        <w:t>locationProvider</w:t>
+      </w:r>
+      <w:r>
+        <w:rPr>
+          <w:b/>
+          <w:bCs/>
+          <w:color w:val="D86DCB" w:themeColor="accent5" w:themeTint="99"/>
+          <w:sz w:val="32"/>
+          <w:szCs w:val="32"/>
+        </w:rPr>
+        <w:t>.dispose</w:t>
+      </w:r>
+      <w:proofErr w:type="spellEnd"/>
+      <w:r>
+        <w:rPr>
+          <w:b/>
+          <w:bCs/>
+          <w:color w:val="D86DCB" w:themeColor="accent5" w:themeTint="99"/>
+          <w:sz w:val="32"/>
+          <w:szCs w:val="32"/>
+        </w:rPr>
+        <w:t>();</w:t>
+      </w:r>
+    </w:p>
+    <w:p>
+      <w:pPr>
+        <w:jc w:val="both"/>
+        <w:rPr>
+          <w:b/>
+          <w:bCs/>
+          <w:color w:val="D86DCB" w:themeColor="accent5" w:themeTint="99"/>
+          <w:sz w:val="32"/>
+          <w:szCs w:val="32"/>
+        </w:rPr>
+      </w:pPr>
+      <w:r>
+        <w:rPr>
+          <w:b/>
+          <w:bCs/>
+          <w:color w:val="D86DCB" w:themeColor="accent5" w:themeTint="99"/>
+          <w:sz w:val="32"/>
+          <w:szCs w:val="32"/>
+        </w:rPr>
+        <w:t xml:space="preserve">    </w:t>
+      </w:r>
+      <w:proofErr w:type="spellStart"/>
       <w:proofErr w:type="gramStart"/>
       <w:r>
         <w:rPr>
@@ -34366,6 +34581,1524 @@
           <w:sz w:val="32"/>
           <w:szCs w:val="32"/>
         </w:rPr>
+        <w:t>super.dispose</w:t>
+      </w:r>
+      <w:proofErr w:type="spellEnd"/>
+      <w:proofErr w:type="gramEnd"/>
+      <w:r>
+        <w:rPr>
+          <w:b/>
+          <w:bCs/>
+          <w:color w:val="D86DCB" w:themeColor="accent5" w:themeTint="99"/>
+          <w:sz w:val="32"/>
+          <w:szCs w:val="32"/>
+        </w:rPr>
+        <w:t>();</w:t>
+      </w:r>
+    </w:p>
+    <w:p>
+      <w:pPr>
+        <w:jc w:val="both"/>
+        <w:rPr>
+          <w:b/>
+          <w:bCs/>
+          <w:color w:val="D86DCB" w:themeColor="accent5" w:themeTint="99"/>
+          <w:sz w:val="32"/>
+          <w:szCs w:val="32"/>
+        </w:rPr>
+      </w:pPr>
+      <w:r>
+        <w:rPr>
+          <w:b/>
+          <w:bCs/>
+          <w:color w:val="D86DCB" w:themeColor="accent5" w:themeTint="99"/>
+          <w:sz w:val="32"/>
+          <w:szCs w:val="32"/>
+        </w:rPr>
+        <w:t xml:space="preserve">  }</w:t>
+      </w:r>
+    </w:p>
+    <w:p>
+      <w:pPr>
+        <w:jc w:val="both"/>
+        <w:rPr>
+          <w:b/>
+          <w:bCs/>
+          <w:color w:val="D86DCB" w:themeColor="accent5" w:themeTint="99"/>
+          <w:sz w:val="32"/>
+          <w:szCs w:val="32"/>
+        </w:rPr>
+      </w:pPr>
+      <w:r>
+        <w:rPr>
+          <w:b/>
+          <w:bCs/>
+          <w:color w:val="D86DCB" w:themeColor="accent5" w:themeTint="99"/>
+          <w:sz w:val="32"/>
+          <w:szCs w:val="32"/>
+        </w:rPr>
+        <w:t>…</w:t>
+      </w:r>
+    </w:p>
+    <w:p>
+      <w:pPr>
+        <w:jc w:val="both"/>
+        <w:rPr>
+          <w:b/>
+          <w:bCs/>
+          <w:color w:val="D86DCB" w:themeColor="accent5" w:themeTint="99"/>
+          <w:sz w:val="32"/>
+          <w:szCs w:val="32"/>
+        </w:rPr>
+      </w:pPr>
+      <w:proofErr w:type="spellStart"/>
+      <w:proofErr w:type="gramStart"/>
+      <w:r>
+        <w:rPr>
+          <w:b/>
+          <w:bCs/>
+          <w:color w:val="D86DCB" w:themeColor="accent5" w:themeTint="99"/>
+          <w:sz w:val="32"/>
+          <w:szCs w:val="32"/>
+        </w:rPr>
+        <w:t>context.watch</w:t>
+      </w:r>
+      <w:proofErr w:type="spellEnd"/>
+      <w:proofErr w:type="gramEnd"/>
+      <w:r>
+        <w:rPr>
+          <w:b/>
+          <w:bCs/>
+          <w:color w:val="D86DCB" w:themeColor="accent5" w:themeTint="99"/>
+          <w:sz w:val="32"/>
+          <w:szCs w:val="32"/>
+        </w:rPr>
+        <w:t>(…) // Or</w:t>
+      </w:r>
+    </w:p>
+    <w:p>
+      <w:pPr>
+        <w:jc w:val="both"/>
+        <w:rPr>
+          <w:b/>
+          <w:bCs/>
+          <w:color w:val="D86DCB" w:themeColor="accent5" w:themeTint="99"/>
+          <w:sz w:val="32"/>
+          <w:szCs w:val="32"/>
+        </w:rPr>
+      </w:pPr>
+      <w:r>
+        <w:rPr>
+          <w:b/>
+          <w:bCs/>
+          <w:color w:val="D86DCB" w:themeColor="accent5" w:themeTint="99"/>
+          <w:sz w:val="32"/>
+          <w:szCs w:val="32"/>
+        </w:rPr>
+        <w:t>Consumer&lt;…</w:t>
+      </w:r>
+      <w:proofErr w:type="gramStart"/>
+      <w:r>
+        <w:rPr>
+          <w:b/>
+          <w:bCs/>
+          <w:color w:val="D86DCB" w:themeColor="accent5" w:themeTint="99"/>
+          <w:sz w:val="32"/>
+          <w:szCs w:val="32"/>
+        </w:rPr>
+        <w:t>&gt;(</w:t>
+      </w:r>
+      <w:proofErr w:type="gramEnd"/>
+      <w:r>
+        <w:rPr>
+          <w:b/>
+          <w:bCs/>
+          <w:color w:val="D86DCB" w:themeColor="accent5" w:themeTint="99"/>
+          <w:sz w:val="32"/>
+          <w:szCs w:val="32"/>
+        </w:rPr>
+        <w:t>…) // Or</w:t>
+      </w:r>
+    </w:p>
+    <w:p>
+      <w:pPr>
+        <w:jc w:val="both"/>
+        <w:rPr>
+          <w:b/>
+          <w:bCs/>
+          <w:color w:val="D86DCB" w:themeColor="accent5" w:themeTint="99"/>
+          <w:sz w:val="32"/>
+          <w:szCs w:val="32"/>
+        </w:rPr>
+      </w:pPr>
+      <w:r>
+        <w:rPr>
+          <w:b/>
+          <w:bCs/>
+          <w:color w:val="D86DCB" w:themeColor="accent5" w:themeTint="99"/>
+          <w:sz w:val="32"/>
+          <w:szCs w:val="32"/>
+        </w:rPr>
+        <w:t xml:space="preserve">Selector&lt;&gt; (…) </w:t>
+      </w:r>
+    </w:p>
+    <w:p>
+      <w:pPr>
+        <w:jc w:val="both"/>
+        <w:rPr>
+          <w:sz w:val="32"/>
+          <w:szCs w:val="32"/>
+        </w:rPr>
+      </w:pPr>
+    </w:p>
+    <w:p>
+      <w:pPr>
+        <w:jc w:val="both"/>
+        <w:rPr>
+          <w:sz w:val="32"/>
+          <w:szCs w:val="32"/>
+        </w:rPr>
+      </w:pPr>
+      <w:r>
+        <w:rPr>
+          <w:sz w:val="32"/>
+          <w:szCs w:val="32"/>
+        </w:rPr>
+        <w:t>Simple Approach (Directly Returning the Stream):</w:t>
+      </w:r>
+    </w:p>
+    <w:p>
+      <w:pPr>
+        <w:jc w:val="both"/>
+        <w:rPr>
+          <w:sz w:val="32"/>
+          <w:szCs w:val="32"/>
+        </w:rPr>
+      </w:pPr>
+      <w:r>
+        <w:rPr>
+          <w:sz w:val="32"/>
+          <w:szCs w:val="32"/>
+        </w:rPr>
+        <w:t>#</w:t>
+      </w:r>
+      <w:r>
+        <w:rPr>
+          <w:sz w:val="32"/>
+          <w:szCs w:val="32"/>
+        </w:rPr>
+        <w:t xml:space="preserve"> If</w:t>
+      </w:r>
+      <w:r>
+        <w:rPr>
+          <w:sz w:val="32"/>
+          <w:szCs w:val="32"/>
+        </w:rPr>
+        <w:t xml:space="preserve"> we</w:t>
+      </w:r>
+      <w:r>
+        <w:rPr>
+          <w:sz w:val="32"/>
+          <w:szCs w:val="32"/>
+        </w:rPr>
+        <w:t xml:space="preserve"> don’t need to transform the </w:t>
+      </w:r>
+      <w:r>
+        <w:rPr>
+          <w:b/>
+          <w:bCs/>
+          <w:sz w:val="32"/>
+          <w:szCs w:val="32"/>
+        </w:rPr>
+        <w:t>Stream</w:t>
+      </w:r>
+      <w:r>
+        <w:rPr>
+          <w:sz w:val="32"/>
+          <w:szCs w:val="32"/>
+        </w:rPr>
+        <w:t xml:space="preserve"> data or additional UI state then we</w:t>
+      </w:r>
+      <w:r>
+        <w:rPr>
+          <w:sz w:val="32"/>
+          <w:szCs w:val="32"/>
+        </w:rPr>
+        <w:t xml:space="preserve"> can directly return the </w:t>
+      </w:r>
+      <w:r>
+        <w:rPr>
+          <w:b/>
+          <w:bCs/>
+          <w:sz w:val="32"/>
+          <w:szCs w:val="32"/>
+        </w:rPr>
+        <w:t>Stream&lt;Position&gt;</w:t>
+      </w:r>
+      <w:r>
+        <w:rPr>
+          <w:sz w:val="32"/>
+          <w:szCs w:val="32"/>
+        </w:rPr>
+        <w:t xml:space="preserve"> so UI can listen to it using</w:t>
+      </w:r>
+      <w:r>
+        <w:rPr>
+          <w:b/>
+          <w:bCs/>
+          <w:sz w:val="32"/>
+          <w:szCs w:val="32"/>
+        </w:rPr>
+        <w:t xml:space="preserve"> </w:t>
+      </w:r>
+      <w:proofErr w:type="spellStart"/>
+      <w:proofErr w:type="gramStart"/>
+      <w:r>
+        <w:rPr>
+          <w:b/>
+          <w:bCs/>
+          <w:sz w:val="32"/>
+          <w:szCs w:val="32"/>
+        </w:rPr>
+        <w:t>StreamBuilder</w:t>
+      </w:r>
+      <w:proofErr w:type="spellEnd"/>
+      <w:r>
+        <w:rPr>
+          <w:b/>
+          <w:bCs/>
+          <w:sz w:val="32"/>
+          <w:szCs w:val="32"/>
+        </w:rPr>
+        <w:t>(</w:t>
+      </w:r>
+      <w:proofErr w:type="gramEnd"/>
+      <w:r>
+        <w:rPr>
+          <w:b/>
+          <w:bCs/>
+          <w:sz w:val="32"/>
+          <w:szCs w:val="32"/>
+        </w:rPr>
+        <w:t>)</w:t>
+      </w:r>
+      <w:r>
+        <w:rPr>
+          <w:sz w:val="32"/>
+          <w:szCs w:val="32"/>
+        </w:rPr>
+        <w:t xml:space="preserve"> or simply </w:t>
+      </w:r>
+      <w:r>
+        <w:rPr>
+          <w:b/>
+          <w:bCs/>
+          <w:sz w:val="32"/>
+          <w:szCs w:val="32"/>
+        </w:rPr>
+        <w:t>.listen()</w:t>
+      </w:r>
+      <w:r>
+        <w:rPr>
+          <w:sz w:val="32"/>
+          <w:szCs w:val="32"/>
+        </w:rPr>
+        <w:t xml:space="preserve"> method</w:t>
+      </w:r>
+    </w:p>
+    <w:p>
+      <w:pPr>
+        <w:jc w:val="both"/>
+        <w:rPr>
+          <w:b/>
+          <w:bCs/>
+          <w:color w:val="D86DCB" w:themeColor="accent5" w:themeTint="99"/>
+          <w:sz w:val="32"/>
+          <w:szCs w:val="32"/>
+        </w:rPr>
+      </w:pPr>
+      <w:r>
+        <w:rPr>
+          <w:b/>
+          <w:bCs/>
+          <w:color w:val="D86DCB" w:themeColor="accent5" w:themeTint="99"/>
+          <w:sz w:val="32"/>
+          <w:szCs w:val="32"/>
+        </w:rPr>
+        <w:t xml:space="preserve">class </w:t>
+      </w:r>
+      <w:proofErr w:type="spellStart"/>
+      <w:r>
+        <w:rPr>
+          <w:b/>
+          <w:bCs/>
+          <w:color w:val="D86DCB" w:themeColor="accent5" w:themeTint="99"/>
+          <w:sz w:val="32"/>
+          <w:szCs w:val="32"/>
+        </w:rPr>
+        <w:t>LocationProvider</w:t>
+      </w:r>
+      <w:proofErr w:type="spellEnd"/>
+      <w:r>
+        <w:rPr>
+          <w:b/>
+          <w:bCs/>
+          <w:color w:val="D86DCB" w:themeColor="accent5" w:themeTint="99"/>
+          <w:sz w:val="32"/>
+          <w:szCs w:val="32"/>
+        </w:rPr>
+        <w:t xml:space="preserve"> extends </w:t>
+      </w:r>
+      <w:proofErr w:type="spellStart"/>
+      <w:r>
+        <w:rPr>
+          <w:b/>
+          <w:bCs/>
+          <w:color w:val="D86DCB" w:themeColor="accent5" w:themeTint="99"/>
+          <w:sz w:val="32"/>
+          <w:szCs w:val="32"/>
+        </w:rPr>
+        <w:t>ChangeNotifier</w:t>
+      </w:r>
+      <w:proofErr w:type="spellEnd"/>
+      <w:r>
+        <w:rPr>
+          <w:b/>
+          <w:bCs/>
+          <w:color w:val="D86DCB" w:themeColor="accent5" w:themeTint="99"/>
+          <w:sz w:val="32"/>
+          <w:szCs w:val="32"/>
+        </w:rPr>
+        <w:t xml:space="preserve"> {</w:t>
+      </w:r>
+    </w:p>
+    <w:p>
+      <w:pPr>
+        <w:jc w:val="both"/>
+        <w:rPr>
+          <w:b/>
+          <w:bCs/>
+          <w:color w:val="D86DCB" w:themeColor="accent5" w:themeTint="99"/>
+          <w:sz w:val="32"/>
+          <w:szCs w:val="32"/>
+        </w:rPr>
+      </w:pPr>
+      <w:r>
+        <w:rPr>
+          <w:b/>
+          <w:bCs/>
+          <w:color w:val="D86DCB" w:themeColor="accent5" w:themeTint="99"/>
+          <w:sz w:val="32"/>
+          <w:szCs w:val="32"/>
+        </w:rPr>
+        <w:t xml:space="preserve">  final </w:t>
+      </w:r>
+      <w:proofErr w:type="spellStart"/>
+      <w:r>
+        <w:rPr>
+          <w:b/>
+          <w:bCs/>
+          <w:color w:val="D86DCB" w:themeColor="accent5" w:themeTint="99"/>
+          <w:sz w:val="32"/>
+          <w:szCs w:val="32"/>
+        </w:rPr>
+        <w:t>GeolocatorPlatform</w:t>
+      </w:r>
+      <w:proofErr w:type="spellEnd"/>
+      <w:r>
+        <w:rPr>
+          <w:b/>
+          <w:bCs/>
+          <w:color w:val="D86DCB" w:themeColor="accent5" w:themeTint="99"/>
+          <w:sz w:val="32"/>
+          <w:szCs w:val="32"/>
+        </w:rPr>
+        <w:t xml:space="preserve"> _geolocator = </w:t>
+      </w:r>
+      <w:proofErr w:type="spellStart"/>
+      <w:r>
+        <w:rPr>
+          <w:b/>
+          <w:bCs/>
+          <w:color w:val="D86DCB" w:themeColor="accent5" w:themeTint="99"/>
+          <w:sz w:val="32"/>
+          <w:szCs w:val="32"/>
+        </w:rPr>
+        <w:t>GeolocatorPlatform.instance</w:t>
+      </w:r>
+      <w:proofErr w:type="spellEnd"/>
+      <w:r>
+        <w:rPr>
+          <w:b/>
+          <w:bCs/>
+          <w:color w:val="D86DCB" w:themeColor="accent5" w:themeTint="99"/>
+          <w:sz w:val="32"/>
+          <w:szCs w:val="32"/>
+        </w:rPr>
+        <w:t>;</w:t>
+      </w:r>
+    </w:p>
+    <w:p>
+      <w:pPr>
+        <w:jc w:val="both"/>
+        <w:rPr>
+          <w:b/>
+          <w:bCs/>
+          <w:color w:val="D86DCB" w:themeColor="accent5" w:themeTint="99"/>
+          <w:sz w:val="32"/>
+          <w:szCs w:val="32"/>
+        </w:rPr>
+      </w:pPr>
+      <w:r>
+        <w:rPr>
+          <w:b/>
+          <w:bCs/>
+          <w:color w:val="D86DCB" w:themeColor="accent5" w:themeTint="99"/>
+          <w:sz w:val="32"/>
+          <w:szCs w:val="32"/>
+        </w:rPr>
+        <w:lastRenderedPageBreak/>
+        <w:t xml:space="preserve">  Stream&lt;Position&gt;</w:t>
+      </w:r>
+      <w:r>
+        <w:rPr>
+          <w:b/>
+          <w:bCs/>
+          <w:color w:val="D86DCB" w:themeColor="accent5" w:themeTint="99"/>
+          <w:sz w:val="32"/>
+          <w:szCs w:val="32"/>
+        </w:rPr>
+        <w:t xml:space="preserve"> get</w:t>
+      </w:r>
+      <w:r>
+        <w:rPr>
+          <w:b/>
+          <w:bCs/>
+          <w:color w:val="D86DCB" w:themeColor="accent5" w:themeTint="99"/>
+          <w:sz w:val="32"/>
+          <w:szCs w:val="32"/>
+        </w:rPr>
+        <w:t xml:space="preserve"> </w:t>
+      </w:r>
+      <w:proofErr w:type="spellStart"/>
+      <w:r>
+        <w:rPr>
+          <w:b/>
+          <w:bCs/>
+          <w:color w:val="D86DCB" w:themeColor="accent5" w:themeTint="99"/>
+          <w:sz w:val="32"/>
+          <w:szCs w:val="32"/>
+        </w:rPr>
+        <w:t>positionStream</w:t>
+      </w:r>
+      <w:proofErr w:type="spellEnd"/>
+      <w:r>
+        <w:rPr>
+          <w:b/>
+          <w:bCs/>
+          <w:color w:val="D86DCB" w:themeColor="accent5" w:themeTint="99"/>
+          <w:sz w:val="32"/>
+          <w:szCs w:val="32"/>
+        </w:rPr>
+        <w:t xml:space="preserve"> =&gt; </w:t>
+      </w:r>
+      <w:r>
+        <w:rPr>
+          <w:b/>
+          <w:bCs/>
+          <w:color w:val="D86DCB" w:themeColor="accent5" w:themeTint="99"/>
+          <w:sz w:val="32"/>
+          <w:szCs w:val="32"/>
+        </w:rPr>
+        <w:t>_</w:t>
+      </w:r>
+      <w:proofErr w:type="spellStart"/>
+      <w:proofErr w:type="gramStart"/>
+      <w:r>
+        <w:rPr>
+          <w:b/>
+          <w:bCs/>
+          <w:color w:val="D86DCB" w:themeColor="accent5" w:themeTint="99"/>
+          <w:sz w:val="32"/>
+          <w:szCs w:val="32"/>
+        </w:rPr>
+        <w:t>geolocator.getPositionStream</w:t>
+      </w:r>
+      <w:proofErr w:type="spellEnd"/>
+      <w:proofErr w:type="gramEnd"/>
+      <w:r>
+        <w:rPr>
+          <w:b/>
+          <w:bCs/>
+          <w:color w:val="D86DCB" w:themeColor="accent5" w:themeTint="99"/>
+          <w:sz w:val="32"/>
+          <w:szCs w:val="32"/>
+        </w:rPr>
+        <w:t>()</w:t>
+      </w:r>
+      <w:r>
+        <w:rPr>
+          <w:b/>
+          <w:bCs/>
+          <w:color w:val="D86DCB" w:themeColor="accent5" w:themeTint="99"/>
+          <w:sz w:val="32"/>
+          <w:szCs w:val="32"/>
+        </w:rPr>
+        <w:t>;</w:t>
+      </w:r>
+    </w:p>
+    <w:p>
+      <w:pPr>
+        <w:jc w:val="both"/>
+        <w:rPr>
+          <w:b/>
+          <w:bCs/>
+          <w:color w:val="D86DCB" w:themeColor="accent5" w:themeTint="99"/>
+          <w:sz w:val="32"/>
+          <w:szCs w:val="32"/>
+        </w:rPr>
+      </w:pPr>
+      <w:r>
+        <w:rPr>
+          <w:b/>
+          <w:bCs/>
+          <w:color w:val="D86DCB" w:themeColor="accent5" w:themeTint="99"/>
+          <w:sz w:val="32"/>
+          <w:szCs w:val="32"/>
+        </w:rPr>
+        <w:t>…</w:t>
+      </w:r>
+    </w:p>
+    <w:p>
+      <w:pPr>
+        <w:jc w:val="both"/>
+        <w:rPr>
+          <w:sz w:val="32"/>
+          <w:szCs w:val="32"/>
+        </w:rPr>
+      </w:pPr>
+      <w:r>
+        <w:rPr>
+          <w:sz w:val="32"/>
+          <w:szCs w:val="32"/>
+        </w:rPr>
+        <w:t xml:space="preserve"># In UI, </w:t>
+      </w:r>
+      <w:proofErr w:type="gramStart"/>
+      <w:r>
+        <w:rPr>
+          <w:sz w:val="32"/>
+          <w:szCs w:val="32"/>
+        </w:rPr>
+        <w:t>and</w:t>
+      </w:r>
+      <w:r>
+        <w:rPr>
+          <w:b/>
+          <w:bCs/>
+          <w:sz w:val="32"/>
+          <w:szCs w:val="32"/>
+        </w:rPr>
+        <w:t xml:space="preserve"> .</w:t>
+      </w:r>
+      <w:proofErr w:type="spellStart"/>
+      <w:r>
+        <w:rPr>
+          <w:b/>
+          <w:bCs/>
+          <w:sz w:val="32"/>
+          <w:szCs w:val="32"/>
+        </w:rPr>
+        <w:t>cancle</w:t>
+      </w:r>
+      <w:proofErr w:type="spellEnd"/>
+      <w:proofErr w:type="gramEnd"/>
+      <w:r>
+        <w:rPr>
+          <w:b/>
+          <w:bCs/>
+          <w:sz w:val="32"/>
+          <w:szCs w:val="32"/>
+        </w:rPr>
+        <w:t>()</w:t>
+      </w:r>
+      <w:r>
+        <w:rPr>
+          <w:sz w:val="32"/>
+          <w:szCs w:val="32"/>
+        </w:rPr>
+        <w:t xml:space="preserve"> is also handled in UI’s </w:t>
+      </w:r>
+      <w:r>
+        <w:rPr>
+          <w:b/>
+          <w:bCs/>
+          <w:sz w:val="32"/>
+          <w:szCs w:val="32"/>
+        </w:rPr>
+        <w:t>dispose()</w:t>
+      </w:r>
+      <w:r>
+        <w:rPr>
+          <w:sz w:val="32"/>
+          <w:szCs w:val="32"/>
+        </w:rPr>
+        <w:t xml:space="preserve"> if we use </w:t>
+      </w:r>
+      <w:proofErr w:type="spellStart"/>
+      <w:r>
+        <w:rPr>
+          <w:b/>
+          <w:bCs/>
+          <w:sz w:val="32"/>
+          <w:szCs w:val="32"/>
+        </w:rPr>
+        <w:t>Stream.listen</w:t>
+      </w:r>
+      <w:proofErr w:type="spellEnd"/>
+      <w:r>
+        <w:rPr>
+          <w:b/>
+          <w:bCs/>
+          <w:sz w:val="32"/>
+          <w:szCs w:val="32"/>
+        </w:rPr>
+        <w:t>()</w:t>
+      </w:r>
+      <w:r>
+        <w:rPr>
+          <w:b/>
+          <w:bCs/>
+          <w:sz w:val="32"/>
+          <w:szCs w:val="32"/>
+        </w:rPr>
+        <w:t xml:space="preserve"> </w:t>
+      </w:r>
+      <w:r>
+        <w:rPr>
+          <w:sz w:val="32"/>
+          <w:szCs w:val="32"/>
+        </w:rPr>
+        <w:t xml:space="preserve">(returns a </w:t>
+      </w:r>
+      <w:proofErr w:type="spellStart"/>
+      <w:r>
+        <w:rPr>
+          <w:b/>
+          <w:bCs/>
+          <w:sz w:val="32"/>
+          <w:szCs w:val="32"/>
+        </w:rPr>
+        <w:t>StreamSubscritpion</w:t>
+      </w:r>
+      <w:proofErr w:type="spellEnd"/>
+      <w:r>
+        <w:rPr>
+          <w:b/>
+          <w:bCs/>
+          <w:sz w:val="32"/>
+          <w:szCs w:val="32"/>
+        </w:rPr>
+        <w:t>&lt;T&gt;</w:t>
+      </w:r>
+      <w:r>
+        <w:rPr>
+          <w:sz w:val="32"/>
+          <w:szCs w:val="32"/>
+        </w:rPr>
+        <w:t>) method</w:t>
+      </w:r>
+    </w:p>
+    <w:p>
+      <w:pPr>
+        <w:jc w:val="both"/>
+        <w:rPr>
+          <w:b/>
+          <w:bCs/>
+          <w:color w:val="D86DCB" w:themeColor="accent5" w:themeTint="99"/>
+          <w:sz w:val="32"/>
+          <w:szCs w:val="32"/>
+        </w:rPr>
+      </w:pPr>
+      <w:r>
+        <w:rPr>
+          <w:b/>
+          <w:bCs/>
+          <w:color w:val="D86DCB" w:themeColor="accent5" w:themeTint="99"/>
+          <w:sz w:val="32"/>
+          <w:szCs w:val="32"/>
+        </w:rPr>
+        <w:t>…</w:t>
+      </w:r>
+    </w:p>
+    <w:p>
+      <w:pPr>
+        <w:jc w:val="both"/>
+        <w:rPr>
+          <w:b/>
+          <w:bCs/>
+          <w:color w:val="D86DCB" w:themeColor="accent5" w:themeTint="99"/>
+          <w:sz w:val="32"/>
+          <w:szCs w:val="32"/>
+        </w:rPr>
+      </w:pPr>
+      <w:r>
+        <w:rPr>
+          <w:b/>
+          <w:bCs/>
+          <w:color w:val="D86DCB" w:themeColor="accent5" w:themeTint="99"/>
+          <w:sz w:val="32"/>
+          <w:szCs w:val="32"/>
+        </w:rPr>
+        <w:t xml:space="preserve">final </w:t>
+      </w:r>
+      <w:proofErr w:type="spellStart"/>
+      <w:r>
+        <w:rPr>
+          <w:b/>
+          <w:bCs/>
+          <w:color w:val="D86DCB" w:themeColor="accent5" w:themeTint="99"/>
+          <w:sz w:val="32"/>
+          <w:szCs w:val="32"/>
+        </w:rPr>
+        <w:t>locationProvider</w:t>
+      </w:r>
+      <w:proofErr w:type="spellEnd"/>
+      <w:r>
+        <w:rPr>
+          <w:b/>
+          <w:bCs/>
+          <w:color w:val="D86DCB" w:themeColor="accent5" w:themeTint="99"/>
+          <w:sz w:val="32"/>
+          <w:szCs w:val="32"/>
+        </w:rPr>
+        <w:t xml:space="preserve"> = </w:t>
+      </w:r>
+      <w:proofErr w:type="spellStart"/>
+      <w:proofErr w:type="gramStart"/>
+      <w:r>
+        <w:rPr>
+          <w:b/>
+          <w:bCs/>
+          <w:color w:val="D86DCB" w:themeColor="accent5" w:themeTint="99"/>
+          <w:sz w:val="32"/>
+          <w:szCs w:val="32"/>
+        </w:rPr>
+        <w:t>LocationProvider</w:t>
+      </w:r>
+      <w:proofErr w:type="spellEnd"/>
+      <w:r>
+        <w:rPr>
+          <w:b/>
+          <w:bCs/>
+          <w:color w:val="D86DCB" w:themeColor="accent5" w:themeTint="99"/>
+          <w:sz w:val="32"/>
+          <w:szCs w:val="32"/>
+        </w:rPr>
+        <w:t>(</w:t>
+      </w:r>
+      <w:proofErr w:type="gramEnd"/>
+      <w:r>
+        <w:rPr>
+          <w:b/>
+          <w:bCs/>
+          <w:color w:val="D86DCB" w:themeColor="accent5" w:themeTint="99"/>
+          <w:sz w:val="32"/>
+          <w:szCs w:val="32"/>
+        </w:rPr>
+        <w:t>);</w:t>
+      </w:r>
+    </w:p>
+    <w:p>
+      <w:pPr>
+        <w:jc w:val="both"/>
+        <w:rPr>
+          <w:b/>
+          <w:bCs/>
+          <w:color w:val="D86DCB" w:themeColor="accent5" w:themeTint="99"/>
+          <w:sz w:val="32"/>
+          <w:szCs w:val="32"/>
+        </w:rPr>
+      </w:pPr>
+      <w:proofErr w:type="spellStart"/>
+      <w:r>
+        <w:rPr>
+          <w:b/>
+          <w:bCs/>
+          <w:color w:val="D86DCB" w:themeColor="accent5" w:themeTint="99"/>
+          <w:sz w:val="32"/>
+          <w:szCs w:val="32"/>
+        </w:rPr>
+        <w:t>ChangeNotifierProvider.value</w:t>
+      </w:r>
+      <w:proofErr w:type="spellEnd"/>
+      <w:r>
+        <w:rPr>
+          <w:b/>
+          <w:bCs/>
+          <w:color w:val="D86DCB" w:themeColor="accent5" w:themeTint="99"/>
+          <w:sz w:val="32"/>
+          <w:szCs w:val="32"/>
+        </w:rPr>
+        <w:t>(</w:t>
+      </w:r>
+    </w:p>
+    <w:p>
+      <w:pPr>
+        <w:jc w:val="both"/>
+        <w:rPr>
+          <w:b/>
+          <w:bCs/>
+          <w:color w:val="D86DCB" w:themeColor="accent5" w:themeTint="99"/>
+          <w:sz w:val="32"/>
+          <w:szCs w:val="32"/>
+        </w:rPr>
+      </w:pPr>
+      <w:r>
+        <w:rPr>
+          <w:b/>
+          <w:bCs/>
+          <w:color w:val="D86DCB" w:themeColor="accent5" w:themeTint="99"/>
+          <w:sz w:val="32"/>
+          <w:szCs w:val="32"/>
+        </w:rPr>
+        <w:t xml:space="preserve">  value: </w:t>
+      </w:r>
+      <w:proofErr w:type="spellStart"/>
+      <w:r>
+        <w:rPr>
+          <w:b/>
+          <w:bCs/>
+          <w:color w:val="D86DCB" w:themeColor="accent5" w:themeTint="99"/>
+          <w:sz w:val="32"/>
+          <w:szCs w:val="32"/>
+        </w:rPr>
+        <w:t>locationProvider</w:t>
+      </w:r>
+      <w:proofErr w:type="spellEnd"/>
+      <w:r>
+        <w:rPr>
+          <w:b/>
+          <w:bCs/>
+          <w:color w:val="D86DCB" w:themeColor="accent5" w:themeTint="99"/>
+          <w:sz w:val="32"/>
+          <w:szCs w:val="32"/>
+        </w:rPr>
+        <w:t>,</w:t>
+      </w:r>
+    </w:p>
+    <w:p>
+      <w:pPr>
+        <w:jc w:val="both"/>
+        <w:rPr>
+          <w:b/>
+          <w:bCs/>
+          <w:color w:val="D86DCB" w:themeColor="accent5" w:themeTint="99"/>
+          <w:sz w:val="32"/>
+          <w:szCs w:val="32"/>
+        </w:rPr>
+      </w:pPr>
+      <w:r>
+        <w:rPr>
+          <w:b/>
+          <w:bCs/>
+          <w:color w:val="D86DCB" w:themeColor="accent5" w:themeTint="99"/>
+          <w:sz w:val="32"/>
+          <w:szCs w:val="32"/>
+        </w:rPr>
+        <w:t xml:space="preserve">   …</w:t>
+      </w:r>
+    </w:p>
+    <w:p>
+      <w:pPr>
+        <w:jc w:val="both"/>
+        <w:rPr>
+          <w:b/>
+          <w:bCs/>
+          <w:color w:val="D86DCB" w:themeColor="accent5" w:themeTint="99"/>
+          <w:sz w:val="32"/>
+          <w:szCs w:val="32"/>
+        </w:rPr>
+      </w:pPr>
+      <w:proofErr w:type="spellStart"/>
+      <w:proofErr w:type="gramStart"/>
+      <w:r>
+        <w:rPr>
+          <w:b/>
+          <w:bCs/>
+          <w:color w:val="D86DCB" w:themeColor="accent5" w:themeTint="99"/>
+          <w:sz w:val="32"/>
+          <w:szCs w:val="32"/>
+        </w:rPr>
+        <w:t>StreamBuilder</w:t>
+      </w:r>
+      <w:proofErr w:type="spellEnd"/>
+      <w:r>
+        <w:rPr>
+          <w:b/>
+          <w:bCs/>
+          <w:color w:val="D86DCB" w:themeColor="accent5" w:themeTint="99"/>
+          <w:sz w:val="32"/>
+          <w:szCs w:val="32"/>
+        </w:rPr>
+        <w:t>(</w:t>
+      </w:r>
+      <w:proofErr w:type="gramEnd"/>
+    </w:p>
+    <w:p>
+      <w:pPr>
+        <w:jc w:val="both"/>
+        <w:rPr>
+          <w:b/>
+          <w:bCs/>
+          <w:color w:val="D86DCB" w:themeColor="accent5" w:themeTint="99"/>
+          <w:sz w:val="32"/>
+          <w:szCs w:val="32"/>
+        </w:rPr>
+      </w:pPr>
+      <w:r>
+        <w:rPr>
+          <w:b/>
+          <w:bCs/>
+          <w:color w:val="D86DCB" w:themeColor="accent5" w:themeTint="99"/>
+          <w:sz w:val="32"/>
+          <w:szCs w:val="32"/>
+        </w:rPr>
+        <w:t xml:space="preserve">  stream: </w:t>
+      </w:r>
+      <w:proofErr w:type="spellStart"/>
+      <w:r>
+        <w:rPr>
+          <w:b/>
+          <w:bCs/>
+          <w:color w:val="D86DCB" w:themeColor="accent5" w:themeTint="99"/>
+          <w:sz w:val="32"/>
+          <w:szCs w:val="32"/>
+        </w:rPr>
+        <w:t>locationProvider.positionStream</w:t>
+      </w:r>
+      <w:proofErr w:type="spellEnd"/>
+    </w:p>
+    <w:p>
+      <w:pPr>
+        <w:jc w:val="both"/>
+        <w:rPr>
+          <w:b/>
+          <w:bCs/>
+          <w:color w:val="D86DCB" w:themeColor="accent5" w:themeTint="99"/>
+          <w:sz w:val="32"/>
+          <w:szCs w:val="32"/>
+        </w:rPr>
+      </w:pPr>
+      <w:r>
+        <w:rPr>
+          <w:b/>
+          <w:bCs/>
+          <w:color w:val="D86DCB" w:themeColor="accent5" w:themeTint="99"/>
+          <w:sz w:val="32"/>
+          <w:szCs w:val="32"/>
+        </w:rPr>
+        <w:t xml:space="preserve">  builder: ...</w:t>
+      </w:r>
+    </w:p>
+    <w:p>
+      <w:pPr>
+        <w:jc w:val="both"/>
+        <w:rPr>
+          <w:b/>
+          <w:bCs/>
+          <w:color w:val="D86DCB" w:themeColor="accent5" w:themeTint="99"/>
+          <w:sz w:val="32"/>
+          <w:szCs w:val="32"/>
+        </w:rPr>
+      </w:pPr>
+      <w:r>
+        <w:rPr>
+          <w:b/>
+          <w:bCs/>
+          <w:color w:val="D86DCB" w:themeColor="accent5" w:themeTint="99"/>
+          <w:sz w:val="32"/>
+          <w:szCs w:val="32"/>
+        </w:rPr>
+        <w:t>)</w:t>
+      </w:r>
+    </w:p>
+    <w:p>
+      <w:pPr>
+        <w:jc w:val="both"/>
+        <w:rPr>
+          <w:b/>
+          <w:bCs/>
+          <w:color w:val="D86DCB" w:themeColor="accent5" w:themeTint="99"/>
+          <w:sz w:val="32"/>
+          <w:szCs w:val="32"/>
+        </w:rPr>
+      </w:pPr>
+      <w:r>
+        <w:rPr>
+          <w:b/>
+          <w:bCs/>
+          <w:color w:val="D86DCB" w:themeColor="accent5" w:themeTint="99"/>
+          <w:sz w:val="32"/>
+          <w:szCs w:val="32"/>
+        </w:rPr>
+        <w:t>…</w:t>
+      </w:r>
+    </w:p>
+    <w:p>
+      <w:pPr>
+        <w:jc w:val="both"/>
+        <w:rPr>
+          <w:b/>
+          <w:bCs/>
+          <w:color w:val="D86DCB" w:themeColor="accent5" w:themeTint="99"/>
+          <w:sz w:val="32"/>
+          <w:szCs w:val="32"/>
+        </w:rPr>
+      </w:pPr>
+      <w:r>
+        <w:rPr>
+          <w:b/>
+          <w:bCs/>
+          <w:color w:val="D86DCB" w:themeColor="accent5" w:themeTint="99"/>
+          <w:sz w:val="32"/>
+          <w:szCs w:val="32"/>
+        </w:rPr>
+        <w:t xml:space="preserve">subscription = </w:t>
+      </w:r>
+      <w:proofErr w:type="spellStart"/>
+      <w:proofErr w:type="gramStart"/>
+      <w:r>
+        <w:rPr>
+          <w:b/>
+          <w:bCs/>
+          <w:color w:val="D86DCB" w:themeColor="accent5" w:themeTint="99"/>
+          <w:sz w:val="32"/>
+          <w:szCs w:val="32"/>
+        </w:rPr>
+        <w:t>locationProvider.positionStream.listen</w:t>
+      </w:r>
+      <w:proofErr w:type="spellEnd"/>
+      <w:proofErr w:type="gramEnd"/>
+      <w:r>
+        <w:rPr>
+          <w:b/>
+          <w:bCs/>
+          <w:color w:val="D86DCB" w:themeColor="accent5" w:themeTint="99"/>
+          <w:sz w:val="32"/>
+          <w:szCs w:val="32"/>
+        </w:rPr>
+        <w:t>(</w:t>
+      </w:r>
+    </w:p>
+    <w:p>
+      <w:pPr>
+        <w:jc w:val="both"/>
+        <w:rPr>
+          <w:b/>
+          <w:bCs/>
+          <w:color w:val="D86DCB" w:themeColor="accent5" w:themeTint="99"/>
+          <w:sz w:val="32"/>
+          <w:szCs w:val="32"/>
+        </w:rPr>
+      </w:pPr>
+      <w:r>
+        <w:rPr>
+          <w:b/>
+          <w:bCs/>
+          <w:color w:val="D86DCB" w:themeColor="accent5" w:themeTint="99"/>
+          <w:sz w:val="32"/>
+          <w:szCs w:val="32"/>
+        </w:rPr>
+        <w:t xml:space="preserve">    …</w:t>
+      </w:r>
+    </w:p>
+    <w:p>
+      <w:pPr>
+        <w:jc w:val="both"/>
+        <w:rPr>
+          <w:b/>
+          <w:bCs/>
+          <w:color w:val="D86DCB" w:themeColor="accent5" w:themeTint="99"/>
+          <w:sz w:val="32"/>
+          <w:szCs w:val="32"/>
+        </w:rPr>
+      </w:pPr>
+      <w:r>
+        <w:rPr>
+          <w:b/>
+          <w:bCs/>
+          <w:color w:val="D86DCB" w:themeColor="accent5" w:themeTint="99"/>
+          <w:sz w:val="32"/>
+          <w:szCs w:val="32"/>
+        </w:rPr>
+        <w:t>)</w:t>
+      </w:r>
+    </w:p>
+    <w:p>
+      <w:pPr>
+        <w:jc w:val="both"/>
+        <w:rPr>
+          <w:b/>
+          <w:bCs/>
+          <w:color w:val="D86DCB" w:themeColor="accent5" w:themeTint="99"/>
+          <w:sz w:val="32"/>
+          <w:szCs w:val="32"/>
+        </w:rPr>
+      </w:pPr>
+      <w:r>
+        <w:rPr>
+          <w:b/>
+          <w:bCs/>
+          <w:color w:val="D86DCB" w:themeColor="accent5" w:themeTint="99"/>
+          <w:sz w:val="32"/>
+          <w:szCs w:val="32"/>
+        </w:rPr>
+        <w:t>@overrdie</w:t>
+      </w:r>
+    </w:p>
+    <w:p>
+      <w:pPr>
+        <w:jc w:val="both"/>
+        <w:rPr>
+          <w:b/>
+          <w:bCs/>
+          <w:color w:val="D86DCB" w:themeColor="accent5" w:themeTint="99"/>
+          <w:sz w:val="32"/>
+          <w:szCs w:val="32"/>
+        </w:rPr>
+      </w:pPr>
+      <w:r>
+        <w:rPr>
+          <w:b/>
+          <w:bCs/>
+          <w:color w:val="D86DCB" w:themeColor="accent5" w:themeTint="99"/>
+          <w:sz w:val="32"/>
+          <w:szCs w:val="32"/>
+        </w:rPr>
+        <w:t xml:space="preserve">void </w:t>
+      </w:r>
+      <w:proofErr w:type="gramStart"/>
+      <w:r>
+        <w:rPr>
+          <w:b/>
+          <w:bCs/>
+          <w:color w:val="D86DCB" w:themeColor="accent5" w:themeTint="99"/>
+          <w:sz w:val="32"/>
+          <w:szCs w:val="32"/>
+        </w:rPr>
+        <w:t>dispose(</w:t>
+      </w:r>
+      <w:proofErr w:type="gramEnd"/>
+      <w:r>
+        <w:rPr>
+          <w:b/>
+          <w:bCs/>
+          <w:color w:val="D86DCB" w:themeColor="accent5" w:themeTint="99"/>
+          <w:sz w:val="32"/>
+          <w:szCs w:val="32"/>
+        </w:rPr>
+        <w:t>) {</w:t>
+      </w:r>
+    </w:p>
+    <w:p>
+      <w:pPr>
+        <w:jc w:val="both"/>
+        <w:rPr>
+          <w:b/>
+          <w:bCs/>
+          <w:color w:val="D86DCB" w:themeColor="accent5" w:themeTint="99"/>
+          <w:sz w:val="32"/>
+          <w:szCs w:val="32"/>
+        </w:rPr>
+      </w:pPr>
+      <w:r>
+        <w:rPr>
+          <w:b/>
+          <w:bCs/>
+          <w:color w:val="D86DCB" w:themeColor="accent5" w:themeTint="99"/>
+          <w:sz w:val="32"/>
+          <w:szCs w:val="32"/>
+        </w:rPr>
+        <w:t xml:space="preserve">   //</w:t>
+      </w:r>
+      <w:r>
+        <w:rPr>
+          <w:b/>
+          <w:bCs/>
+          <w:color w:val="D86DCB" w:themeColor="accent5" w:themeTint="99"/>
+          <w:sz w:val="32"/>
+          <w:szCs w:val="32"/>
+        </w:rPr>
+        <w:t xml:space="preserve"> </w:t>
+      </w:r>
+      <w:r>
+        <w:rPr>
+          <w:b/>
+          <w:bCs/>
+          <w:color w:val="D86DCB" w:themeColor="accent5" w:themeTint="99"/>
+          <w:sz w:val="32"/>
+          <w:szCs w:val="32"/>
+        </w:rPr>
+        <w:t xml:space="preserve">context here is dangerous, </w:t>
+      </w:r>
+      <w:r>
+        <w:rPr>
+          <w:b/>
+          <w:bCs/>
+          <w:color w:val="D86DCB" w:themeColor="accent5" w:themeTint="99"/>
+          <w:sz w:val="32"/>
+          <w:szCs w:val="32"/>
+        </w:rPr>
+        <w:t xml:space="preserve">that’s why </w:t>
+      </w:r>
+      <w:proofErr w:type="spellStart"/>
+      <w:r>
+        <w:rPr>
+          <w:b/>
+          <w:bCs/>
+          <w:color w:val="D86DCB" w:themeColor="accent5" w:themeTint="99"/>
+          <w:sz w:val="32"/>
+          <w:szCs w:val="32"/>
+        </w:rPr>
+        <w:t>ChangeNotiferProvider.value</w:t>
+      </w:r>
+      <w:proofErr w:type="spellEnd"/>
+      <w:r>
+        <w:rPr>
+          <w:b/>
+          <w:bCs/>
+          <w:color w:val="D86DCB" w:themeColor="accent5" w:themeTint="99"/>
+          <w:sz w:val="32"/>
+          <w:szCs w:val="32"/>
+        </w:rPr>
+        <w:t xml:space="preserve"> is used </w:t>
+      </w:r>
+    </w:p>
+    <w:p>
+      <w:pPr>
+        <w:jc w:val="both"/>
+        <w:rPr>
+          <w:b/>
+          <w:bCs/>
+          <w:color w:val="D86DCB" w:themeColor="accent5" w:themeTint="99"/>
+          <w:sz w:val="32"/>
+          <w:szCs w:val="32"/>
+        </w:rPr>
+      </w:pPr>
+      <w:r>
+        <w:rPr>
+          <w:b/>
+          <w:bCs/>
+          <w:color w:val="D86DCB" w:themeColor="accent5" w:themeTint="99"/>
+          <w:sz w:val="32"/>
+          <w:szCs w:val="32"/>
+        </w:rPr>
+        <w:t xml:space="preserve">   </w:t>
+      </w:r>
+      <w:proofErr w:type="spellStart"/>
+      <w:proofErr w:type="gramStart"/>
+      <w:r>
+        <w:rPr>
+          <w:b/>
+          <w:bCs/>
+          <w:color w:val="D86DCB" w:themeColor="accent5" w:themeTint="99"/>
+          <w:sz w:val="32"/>
+          <w:szCs w:val="32"/>
+        </w:rPr>
+        <w:t>subscritption</w:t>
+      </w:r>
+      <w:proofErr w:type="spellEnd"/>
+      <w:r>
+        <w:rPr>
+          <w:b/>
+          <w:bCs/>
+          <w:color w:val="D86DCB" w:themeColor="accent5" w:themeTint="99"/>
+          <w:sz w:val="32"/>
+          <w:szCs w:val="32"/>
+        </w:rPr>
+        <w:t>?.</w:t>
+      </w:r>
+      <w:proofErr w:type="gramEnd"/>
+      <w:r>
+        <w:rPr>
+          <w:b/>
+          <w:bCs/>
+          <w:color w:val="D86DCB" w:themeColor="accent5" w:themeTint="99"/>
+          <w:sz w:val="32"/>
+          <w:szCs w:val="32"/>
+        </w:rPr>
+        <w:t>cancel();</w:t>
+      </w:r>
+    </w:p>
+    <w:p>
+      <w:pPr>
+        <w:jc w:val="both"/>
+        <w:rPr>
+          <w:b/>
+          <w:bCs/>
+          <w:color w:val="D86DCB" w:themeColor="accent5" w:themeTint="99"/>
+          <w:sz w:val="32"/>
+          <w:szCs w:val="32"/>
+        </w:rPr>
+      </w:pPr>
+      <w:r>
+        <w:rPr>
+          <w:b/>
+          <w:bCs/>
+          <w:color w:val="D86DCB" w:themeColor="accent5" w:themeTint="99"/>
+          <w:sz w:val="32"/>
+          <w:szCs w:val="32"/>
+        </w:rPr>
+        <w:lastRenderedPageBreak/>
+        <w:t xml:space="preserve">   </w:t>
+      </w:r>
+      <w:proofErr w:type="spellStart"/>
+      <w:proofErr w:type="gramStart"/>
+      <w:r>
+        <w:rPr>
+          <w:b/>
+          <w:bCs/>
+          <w:color w:val="D86DCB" w:themeColor="accent5" w:themeTint="99"/>
+          <w:sz w:val="32"/>
+          <w:szCs w:val="32"/>
+        </w:rPr>
+        <w:t>super.dispose</w:t>
+      </w:r>
+      <w:proofErr w:type="spellEnd"/>
+      <w:proofErr w:type="gramEnd"/>
+      <w:r>
+        <w:rPr>
+          <w:b/>
+          <w:bCs/>
+          <w:color w:val="D86DCB" w:themeColor="accent5" w:themeTint="99"/>
+          <w:sz w:val="32"/>
+          <w:szCs w:val="32"/>
+        </w:rPr>
+        <w:t>();</w:t>
+      </w:r>
+    </w:p>
+    <w:p>
+      <w:pPr>
+        <w:jc w:val="both"/>
+        <w:rPr>
+          <w:b/>
+          <w:bCs/>
+          <w:color w:val="D86DCB" w:themeColor="accent5" w:themeTint="99"/>
+          <w:sz w:val="32"/>
+          <w:szCs w:val="32"/>
+        </w:rPr>
+      </w:pPr>
+      <w:r>
+        <w:rPr>
+          <w:b/>
+          <w:bCs/>
+          <w:color w:val="D86DCB" w:themeColor="accent5" w:themeTint="99"/>
+          <w:sz w:val="32"/>
+          <w:szCs w:val="32"/>
+        </w:rPr>
+        <w:t>}</w:t>
+      </w:r>
+    </w:p>
+    <w:p>
+      <w:pPr>
+        <w:jc w:val="both"/>
+        <w:rPr>
+          <w:sz w:val="32"/>
+          <w:szCs w:val="32"/>
+        </w:rPr>
+      </w:pPr>
+    </w:p>
+    <w:p>
+      <w:pPr>
+        <w:jc w:val="both"/>
+        <w:rPr>
+          <w:sz w:val="32"/>
+          <w:szCs w:val="32"/>
+        </w:rPr>
+      </w:pPr>
+      <w:r>
+        <w:rPr>
+          <w:sz w:val="32"/>
+          <w:szCs w:val="32"/>
+        </w:rPr>
+        <w:t xml:space="preserve">Using </w:t>
+      </w:r>
+      <w:proofErr w:type="spellStart"/>
+      <w:r>
+        <w:rPr>
+          <w:sz w:val="32"/>
+          <w:szCs w:val="32"/>
+        </w:rPr>
+        <w:t>ValueChanged</w:t>
+      </w:r>
+      <w:proofErr w:type="spellEnd"/>
+      <w:r>
+        <w:rPr>
+          <w:sz w:val="32"/>
+          <w:szCs w:val="32"/>
+        </w:rPr>
+        <w:t>&lt;T&gt; For Listening to Stream values:</w:t>
+      </w:r>
+    </w:p>
+    <w:p>
+      <w:pPr>
+        <w:jc w:val="both"/>
+        <w:rPr>
+          <w:sz w:val="32"/>
+          <w:szCs w:val="32"/>
+        </w:rPr>
+      </w:pPr>
+      <w:r>
+        <w:rPr>
+          <w:sz w:val="32"/>
+          <w:szCs w:val="32"/>
+        </w:rPr>
+        <w:t xml:space="preserve"># </w:t>
+      </w:r>
+      <w:r>
+        <w:rPr>
+          <w:b/>
+          <w:bCs/>
+          <w:sz w:val="32"/>
+          <w:szCs w:val="32"/>
+        </w:rPr>
+        <w:t>REMEMBER</w:t>
+      </w:r>
+      <w:r>
+        <w:rPr>
+          <w:sz w:val="32"/>
+          <w:szCs w:val="32"/>
+        </w:rPr>
+        <w:t xml:space="preserve">, Controllers like </w:t>
+      </w:r>
+      <w:proofErr w:type="spellStart"/>
+      <w:r>
+        <w:rPr>
+          <w:b/>
+          <w:bCs/>
+          <w:sz w:val="32"/>
+          <w:szCs w:val="32"/>
+        </w:rPr>
+        <w:t>mapController</w:t>
+      </w:r>
+      <w:proofErr w:type="spellEnd"/>
+      <w:r>
+        <w:rPr>
+          <w:sz w:val="32"/>
+          <w:szCs w:val="32"/>
+        </w:rPr>
+        <w:t xml:space="preserve"> or anything doesn’t work with </w:t>
+      </w:r>
+      <w:proofErr w:type="spellStart"/>
+      <w:proofErr w:type="gramStart"/>
+      <w:r>
+        <w:rPr>
+          <w:b/>
+          <w:bCs/>
+          <w:sz w:val="32"/>
+          <w:szCs w:val="32"/>
+        </w:rPr>
         <w:t>context.read</w:t>
       </w:r>
       <w:proofErr w:type="spellEnd"/>
@@ -34374,101 +36107,123 @@
         <w:rPr>
           <w:b/>
           <w:bCs/>
-          <w:color w:val="D86DCB" w:themeColor="accent5" w:themeTint="99"/>
-          <w:sz w:val="32"/>
-          <w:szCs w:val="32"/>
-        </w:rPr>
-        <w:t>&lt;</w:t>
-      </w:r>
-      <w:proofErr w:type="spellStart"/>
-      <w:r>
-        <w:rPr>
-          <w:b/>
-          <w:bCs/>
-          <w:color w:val="D86DCB" w:themeColor="accent5" w:themeTint="99"/>
-          <w:sz w:val="32"/>
-          <w:szCs w:val="32"/>
-        </w:rPr>
-        <w:t>LocationProvider</w:t>
-      </w:r>
-      <w:proofErr w:type="spellEnd"/>
-      <w:r>
-        <w:rPr>
-          <w:b/>
-          <w:bCs/>
-          <w:color w:val="D86DCB" w:themeColor="accent5" w:themeTint="99"/>
-          <w:sz w:val="32"/>
-          <w:szCs w:val="32"/>
-        </w:rPr>
-        <w:t>&gt;().</w:t>
-      </w:r>
-      <w:proofErr w:type="spellStart"/>
-      <w:r>
-        <w:rPr>
-          <w:b/>
-          <w:bCs/>
-          <w:color w:val="D86DCB" w:themeColor="accent5" w:themeTint="99"/>
-          <w:sz w:val="32"/>
-          <w:szCs w:val="32"/>
-        </w:rPr>
-        <w:t>stopListening</w:t>
-      </w:r>
-      <w:proofErr w:type="spellEnd"/>
-      <w:r>
-        <w:rPr>
-          <w:b/>
-          <w:bCs/>
-          <w:color w:val="D86DCB" w:themeColor="accent5" w:themeTint="99"/>
-          <w:sz w:val="32"/>
-          <w:szCs w:val="32"/>
-        </w:rPr>
-        <w:t>();</w:t>
-      </w:r>
-    </w:p>
-    <w:p>
-      <w:pPr>
-        <w:jc w:val="both"/>
-        <w:rPr>
-          <w:b/>
-          <w:bCs/>
-          <w:color w:val="D86DCB" w:themeColor="accent5" w:themeTint="99"/>
-          <w:sz w:val="32"/>
-          <w:szCs w:val="32"/>
-        </w:rPr>
-      </w:pPr>
-      <w:r>
-        <w:rPr>
-          <w:b/>
-          <w:bCs/>
-          <w:color w:val="D86DCB" w:themeColor="accent5" w:themeTint="99"/>
-          <w:sz w:val="32"/>
-          <w:szCs w:val="32"/>
-        </w:rPr>
-        <w:t xml:space="preserve">    // Or</w:t>
-      </w:r>
-    </w:p>
-    <w:p>
-      <w:pPr>
-        <w:jc w:val="both"/>
-        <w:rPr>
-          <w:b/>
-          <w:bCs/>
-          <w:color w:val="D86DCB" w:themeColor="accent5" w:themeTint="99"/>
-          <w:sz w:val="32"/>
-          <w:szCs w:val="32"/>
-        </w:rPr>
-      </w:pPr>
-      <w:r>
-        <w:rPr>
-          <w:b/>
-          <w:bCs/>
-          <w:color w:val="D86DCB" w:themeColor="accent5" w:themeTint="99"/>
-          <w:sz w:val="32"/>
-          <w:szCs w:val="32"/>
-        </w:rPr>
-        <w:t xml:space="preserve">    </w:t>
-      </w:r>
-      <w:proofErr w:type="spellStart"/>
+          <w:sz w:val="32"/>
+          <w:szCs w:val="32"/>
+        </w:rPr>
+        <w:t>().value</w:t>
+      </w:r>
+      <w:r>
+        <w:rPr>
+          <w:sz w:val="32"/>
+          <w:szCs w:val="32"/>
+        </w:rPr>
+        <w:t xml:space="preserve"> instead because </w:t>
+      </w:r>
+      <w:r>
+        <w:rPr>
+          <w:b/>
+          <w:bCs/>
+          <w:sz w:val="32"/>
+          <w:szCs w:val="32"/>
+        </w:rPr>
+        <w:t>watch()</w:t>
+      </w:r>
+      <w:r>
+        <w:rPr>
+          <w:sz w:val="32"/>
+          <w:szCs w:val="32"/>
+        </w:rPr>
+        <w:t xml:space="preserve"> is for UI rendering and </w:t>
+      </w:r>
+      <w:r>
+        <w:rPr>
+          <w:b/>
+          <w:bCs/>
+          <w:sz w:val="32"/>
+          <w:szCs w:val="32"/>
+        </w:rPr>
+        <w:t>listen()</w:t>
+      </w:r>
+      <w:r>
+        <w:rPr>
+          <w:sz w:val="32"/>
+          <w:szCs w:val="32"/>
+        </w:rPr>
+        <w:t xml:space="preserve"> is for side effects. we have to use </w:t>
+      </w:r>
+      <w:proofErr w:type="spellStart"/>
+      <w:r>
+        <w:rPr>
+          <w:b/>
+          <w:bCs/>
+          <w:sz w:val="32"/>
+          <w:szCs w:val="32"/>
+        </w:rPr>
+        <w:t>ValueChanged</w:t>
+      </w:r>
+      <w:proofErr w:type="spellEnd"/>
+      <w:r>
+        <w:rPr>
+          <w:b/>
+          <w:bCs/>
+          <w:sz w:val="32"/>
+          <w:szCs w:val="32"/>
+        </w:rPr>
+        <w:t xml:space="preserve">&lt;…&gt; </w:t>
+      </w:r>
+      <w:r>
+        <w:rPr>
+          <w:sz w:val="32"/>
+          <w:szCs w:val="32"/>
+        </w:rPr>
+        <w:t>C</w:t>
+      </w:r>
+      <w:r>
+        <w:rPr>
+          <w:sz w:val="32"/>
+          <w:szCs w:val="32"/>
+        </w:rPr>
+        <w:t xml:space="preserve">allback method to listen to values directly from </w:t>
+      </w:r>
+      <w:proofErr w:type="spellStart"/>
+      <w:r>
+        <w:rPr>
+          <w:b/>
+          <w:bCs/>
+          <w:sz w:val="32"/>
+          <w:szCs w:val="32"/>
+        </w:rPr>
+        <w:t>StreamSubscription</w:t>
+      </w:r>
+      <w:proofErr w:type="spellEnd"/>
+      <w:r>
+        <w:rPr>
+          <w:b/>
+          <w:bCs/>
+          <w:sz w:val="32"/>
+          <w:szCs w:val="32"/>
+        </w:rPr>
+        <w:t>&lt;…&gt;</w:t>
+      </w:r>
+      <w:r>
+        <w:rPr>
+          <w:sz w:val="32"/>
+          <w:szCs w:val="32"/>
+        </w:rPr>
+        <w:t xml:space="preserve"> from notifier class in UI</w:t>
+      </w:r>
+    </w:p>
+    <w:p>
+      <w:pPr>
+        <w:jc w:val="both"/>
+        <w:rPr>
+          <w:b/>
+          <w:bCs/>
+          <w:color w:val="D86DCB" w:themeColor="accent5" w:themeTint="99"/>
+          <w:sz w:val="32"/>
+          <w:szCs w:val="32"/>
+        </w:rPr>
+      </w:pPr>
       <w:proofErr w:type="gramStart"/>
       <w:r>
         <w:rPr>
@@ -34478,7 +36233,18 @@
           <w:sz w:val="32"/>
           <w:szCs w:val="32"/>
         </w:rPr>
-        <w:t>context.read</w:t>
+        <w:t xml:space="preserve">void  </w:t>
+      </w:r>
+      <w:proofErr w:type="spellStart"/>
+      <w:r>
+        <w:rPr>
+          <w:b/>
+          <w:bCs/>
+          <w:color w:val="D86DCB" w:themeColor="accent5" w:themeTint="99"/>
+          <w:sz w:val="32"/>
+          <w:szCs w:val="32"/>
+        </w:rPr>
+        <w:t>listenStream</w:t>
       </w:r>
       <w:proofErr w:type="spellEnd"/>
       <w:proofErr w:type="gramEnd"/>
@@ -34490,51 +36256,73 @@
           <w:sz w:val="32"/>
           <w:szCs w:val="32"/>
         </w:rPr>
-        <w:t>&lt;</w:t>
-      </w:r>
-      <w:proofErr w:type="spellStart"/>
-      <w:r>
-        <w:rPr>
-          <w:b/>
-          <w:bCs/>
-          <w:color w:val="D86DCB" w:themeColor="accent5" w:themeTint="99"/>
-          <w:sz w:val="32"/>
-          <w:szCs w:val="32"/>
-        </w:rPr>
-        <w:t>LocationProvider</w:t>
-      </w:r>
-      <w:proofErr w:type="spellEnd"/>
-      <w:r>
-        <w:rPr>
-          <w:b/>
-          <w:bCs/>
-          <w:color w:val="D86DCB" w:themeColor="accent5" w:themeTint="99"/>
-          <w:sz w:val="32"/>
-          <w:szCs w:val="32"/>
-        </w:rPr>
-        <w:t>&gt;().dispose();</w:t>
-      </w:r>
-    </w:p>
-    <w:p>
-      <w:pPr>
-        <w:jc w:val="both"/>
-        <w:rPr>
-          <w:b/>
-          <w:bCs/>
-          <w:color w:val="D86DCB" w:themeColor="accent5" w:themeTint="99"/>
-          <w:sz w:val="32"/>
-          <w:szCs w:val="32"/>
-        </w:rPr>
-      </w:pPr>
-      <w:r>
-        <w:rPr>
-          <w:b/>
-          <w:bCs/>
-          <w:color w:val="D86DCB" w:themeColor="accent5" w:themeTint="99"/>
-          <w:sz w:val="32"/>
-          <w:szCs w:val="32"/>
-        </w:rPr>
-        <w:t xml:space="preserve">    </w:t>
+        <w:t>(</w:t>
+      </w:r>
+      <w:proofErr w:type="spellStart"/>
+      <w:r>
+        <w:rPr>
+          <w:b/>
+          <w:bCs/>
+          <w:color w:val="D86DCB" w:themeColor="accent5" w:themeTint="99"/>
+          <w:sz w:val="32"/>
+          <w:szCs w:val="32"/>
+        </w:rPr>
+        <w:t>ValueChanged</w:t>
+      </w:r>
+      <w:proofErr w:type="spellEnd"/>
+      <w:r>
+        <w:rPr>
+          <w:b/>
+          <w:bCs/>
+          <w:color w:val="D86DCB" w:themeColor="accent5" w:themeTint="99"/>
+          <w:sz w:val="32"/>
+          <w:szCs w:val="32"/>
+        </w:rPr>
+        <w:t xml:space="preserve">&lt;…&gt; </w:t>
+      </w:r>
+      <w:proofErr w:type="spellStart"/>
+      <w:r>
+        <w:rPr>
+          <w:b/>
+          <w:bCs/>
+          <w:color w:val="D86DCB" w:themeColor="accent5" w:themeTint="99"/>
+          <w:sz w:val="32"/>
+          <w:szCs w:val="32"/>
+        </w:rPr>
+        <w:t>onChanged</w:t>
+      </w:r>
+      <w:proofErr w:type="spellEnd"/>
+      <w:r>
+        <w:rPr>
+          <w:b/>
+          <w:bCs/>
+          <w:color w:val="D86DCB" w:themeColor="accent5" w:themeTint="99"/>
+          <w:sz w:val="32"/>
+          <w:szCs w:val="32"/>
+        </w:rPr>
+        <w:t>) {</w:t>
+      </w:r>
+    </w:p>
+    <w:p>
+      <w:pPr>
+        <w:jc w:val="both"/>
+        <w:rPr>
+          <w:b/>
+          <w:bCs/>
+          <w:color w:val="D86DCB" w:themeColor="accent5" w:themeTint="99"/>
+          <w:sz w:val="32"/>
+          <w:szCs w:val="32"/>
+        </w:rPr>
+      </w:pPr>
+      <w:r>
+        <w:rPr>
+          <w:b/>
+          <w:bCs/>
+          <w:color w:val="D86DCB" w:themeColor="accent5" w:themeTint="99"/>
+          <w:sz w:val="32"/>
+          <w:szCs w:val="32"/>
+        </w:rPr>
+        <w:t>_subscription = _</w:t>
       </w:r>
       <w:proofErr w:type="spellStart"/>
       <w:proofErr w:type="gramStart"/>
@@ -34546,7 +36334,7 @@
           <w:sz w:val="32"/>
           <w:szCs w:val="32"/>
         </w:rPr>
-        <w:t>super.dispose</w:t>
+        <w:t>geolocator.getPositionStream</w:t>
       </w:r>
       <w:proofErr w:type="spellEnd"/>
       <w:proofErr w:type="gramEnd"/>
@@ -34558,419 +36346,7 @@
           <w:sz w:val="32"/>
           <w:szCs w:val="32"/>
         </w:rPr>
-        <w:t>();</w:t>
-      </w:r>
-    </w:p>
-    <w:p>
-      <w:pPr>
-        <w:jc w:val="both"/>
-        <w:rPr>
-          <w:b/>
-          <w:bCs/>
-          <w:color w:val="D86DCB" w:themeColor="accent5" w:themeTint="99"/>
-          <w:sz w:val="32"/>
-          <w:szCs w:val="32"/>
-        </w:rPr>
-      </w:pPr>
-      <w:r>
-        <w:rPr>
-          <w:b/>
-          <w:bCs/>
-          <w:color w:val="D86DCB" w:themeColor="accent5" w:themeTint="99"/>
-          <w:sz w:val="32"/>
-          <w:szCs w:val="32"/>
-        </w:rPr>
-        <w:t xml:space="preserve">  }</w:t>
-      </w:r>
-    </w:p>
-    <w:p>
-      <w:pPr>
-        <w:jc w:val="both"/>
-        <w:rPr>
-          <w:b/>
-          <w:bCs/>
-          <w:color w:val="D86DCB" w:themeColor="accent5" w:themeTint="99"/>
-          <w:sz w:val="32"/>
-          <w:szCs w:val="32"/>
-        </w:rPr>
-      </w:pPr>
-      <w:r>
-        <w:rPr>
-          <w:b/>
-          <w:bCs/>
-          <w:color w:val="D86DCB" w:themeColor="accent5" w:themeTint="99"/>
-          <w:sz w:val="32"/>
-          <w:szCs w:val="32"/>
-        </w:rPr>
-        <w:t>…</w:t>
-      </w:r>
-    </w:p>
-    <w:p>
-      <w:pPr>
-        <w:jc w:val="both"/>
-        <w:rPr>
-          <w:b/>
-          <w:bCs/>
-          <w:color w:val="D86DCB" w:themeColor="accent5" w:themeTint="99"/>
-          <w:sz w:val="32"/>
-          <w:szCs w:val="32"/>
-        </w:rPr>
-      </w:pPr>
-      <w:proofErr w:type="spellStart"/>
-      <w:proofErr w:type="gramStart"/>
-      <w:r>
-        <w:rPr>
-          <w:b/>
-          <w:bCs/>
-          <w:color w:val="D86DCB" w:themeColor="accent5" w:themeTint="99"/>
-          <w:sz w:val="32"/>
-          <w:szCs w:val="32"/>
-        </w:rPr>
-        <w:t>context.watch</w:t>
-      </w:r>
-      <w:proofErr w:type="spellEnd"/>
-      <w:proofErr w:type="gramEnd"/>
-      <w:r>
-        <w:rPr>
-          <w:b/>
-          <w:bCs/>
-          <w:color w:val="D86DCB" w:themeColor="accent5" w:themeTint="99"/>
-          <w:sz w:val="32"/>
-          <w:szCs w:val="32"/>
-        </w:rPr>
-        <w:t>(…) // Or</w:t>
-      </w:r>
-    </w:p>
-    <w:p>
-      <w:pPr>
-        <w:jc w:val="both"/>
-        <w:rPr>
-          <w:b/>
-          <w:bCs/>
-          <w:color w:val="D86DCB" w:themeColor="accent5" w:themeTint="99"/>
-          <w:sz w:val="32"/>
-          <w:szCs w:val="32"/>
-        </w:rPr>
-      </w:pPr>
-      <w:r>
-        <w:rPr>
-          <w:b/>
-          <w:bCs/>
-          <w:color w:val="D86DCB" w:themeColor="accent5" w:themeTint="99"/>
-          <w:sz w:val="32"/>
-          <w:szCs w:val="32"/>
-        </w:rPr>
-        <w:t>Consumer&lt;…</w:t>
-      </w:r>
-      <w:proofErr w:type="gramStart"/>
-      <w:r>
-        <w:rPr>
-          <w:b/>
-          <w:bCs/>
-          <w:color w:val="D86DCB" w:themeColor="accent5" w:themeTint="99"/>
-          <w:sz w:val="32"/>
-          <w:szCs w:val="32"/>
-        </w:rPr>
-        <w:t>&gt;(</w:t>
-      </w:r>
-      <w:proofErr w:type="gramEnd"/>
-      <w:r>
-        <w:rPr>
-          <w:b/>
-          <w:bCs/>
-          <w:color w:val="D86DCB" w:themeColor="accent5" w:themeTint="99"/>
-          <w:sz w:val="32"/>
-          <w:szCs w:val="32"/>
-        </w:rPr>
-        <w:t>…) // Or</w:t>
-      </w:r>
-    </w:p>
-    <w:p>
-      <w:pPr>
-        <w:jc w:val="both"/>
-        <w:rPr>
-          <w:b/>
-          <w:bCs/>
-          <w:color w:val="D86DCB" w:themeColor="accent5" w:themeTint="99"/>
-          <w:sz w:val="32"/>
-          <w:szCs w:val="32"/>
-        </w:rPr>
-      </w:pPr>
-      <w:r>
-        <w:rPr>
-          <w:b/>
-          <w:bCs/>
-          <w:color w:val="D86DCB" w:themeColor="accent5" w:themeTint="99"/>
-          <w:sz w:val="32"/>
-          <w:szCs w:val="32"/>
-        </w:rPr>
-        <w:t xml:space="preserve">Selector&lt;&gt; (…) </w:t>
-      </w:r>
-    </w:p>
-    <w:p>
-      <w:pPr>
-        <w:jc w:val="both"/>
-        <w:rPr>
-          <w:sz w:val="32"/>
-          <w:szCs w:val="32"/>
-        </w:rPr>
-      </w:pPr>
-    </w:p>
-    <w:p>
-      <w:pPr>
-        <w:jc w:val="both"/>
-        <w:rPr>
-          <w:sz w:val="32"/>
-          <w:szCs w:val="32"/>
-        </w:rPr>
-      </w:pPr>
-      <w:r>
-        <w:rPr>
-          <w:b/>
-          <w:bCs/>
-          <w:sz w:val="32"/>
-          <w:szCs w:val="32"/>
-        </w:rPr>
-        <w:t>N</w:t>
-      </w:r>
-      <w:r>
-        <w:rPr>
-          <w:b/>
-          <w:bCs/>
-          <w:sz w:val="32"/>
-          <w:szCs w:val="32"/>
-        </w:rPr>
-        <w:t>OTE</w:t>
-      </w:r>
-      <w:r>
-        <w:rPr>
-          <w:b/>
-          <w:bCs/>
-          <w:sz w:val="32"/>
-          <w:szCs w:val="32"/>
-        </w:rPr>
-        <w:t>:</w:t>
-      </w:r>
-      <w:r>
-        <w:rPr>
-          <w:sz w:val="32"/>
-          <w:szCs w:val="32"/>
-        </w:rPr>
-        <w:t xml:space="preserve"> REMEMBER, Controllers like </w:t>
-      </w:r>
-      <w:proofErr w:type="spellStart"/>
-      <w:r>
-        <w:rPr>
-          <w:b/>
-          <w:bCs/>
-          <w:sz w:val="32"/>
-          <w:szCs w:val="32"/>
-        </w:rPr>
-        <w:t>mapController</w:t>
-      </w:r>
-      <w:proofErr w:type="spellEnd"/>
-      <w:r>
-        <w:rPr>
-          <w:sz w:val="32"/>
-          <w:szCs w:val="32"/>
-        </w:rPr>
-        <w:t xml:space="preserve"> or anything doesn’t work with </w:t>
-      </w:r>
-      <w:proofErr w:type="spellStart"/>
-      <w:proofErr w:type="gramStart"/>
-      <w:r>
-        <w:rPr>
-          <w:b/>
-          <w:bCs/>
-          <w:sz w:val="32"/>
-          <w:szCs w:val="32"/>
-        </w:rPr>
-        <w:t>context.read</w:t>
-      </w:r>
-      <w:proofErr w:type="spellEnd"/>
-      <w:proofErr w:type="gramEnd"/>
-      <w:r>
-        <w:rPr>
-          <w:b/>
-          <w:bCs/>
-          <w:sz w:val="32"/>
-          <w:szCs w:val="32"/>
-        </w:rPr>
-        <w:t>().value</w:t>
-      </w:r>
-      <w:r>
-        <w:rPr>
-          <w:sz w:val="32"/>
-          <w:szCs w:val="32"/>
-        </w:rPr>
-        <w:t xml:space="preserve"> instead because </w:t>
-      </w:r>
-      <w:r>
-        <w:rPr>
-          <w:b/>
-          <w:bCs/>
-          <w:sz w:val="32"/>
-          <w:szCs w:val="32"/>
-        </w:rPr>
-        <w:t>watch()</w:t>
-      </w:r>
-      <w:r>
-        <w:rPr>
-          <w:sz w:val="32"/>
-          <w:szCs w:val="32"/>
-        </w:rPr>
-        <w:t xml:space="preserve"> is for UI rendering and </w:t>
-      </w:r>
-      <w:r>
-        <w:rPr>
-          <w:b/>
-          <w:bCs/>
-          <w:sz w:val="32"/>
-          <w:szCs w:val="32"/>
-        </w:rPr>
-        <w:t>listen()</w:t>
-      </w:r>
-      <w:r>
-        <w:rPr>
-          <w:sz w:val="32"/>
-          <w:szCs w:val="32"/>
-        </w:rPr>
-        <w:t xml:space="preserve"> is for side effects. we have to use </w:t>
-      </w:r>
-      <w:proofErr w:type="spellStart"/>
-      <w:r>
-        <w:rPr>
-          <w:b/>
-          <w:bCs/>
-          <w:sz w:val="32"/>
-          <w:szCs w:val="32"/>
-        </w:rPr>
-        <w:t>ValueChanged</w:t>
-      </w:r>
-      <w:proofErr w:type="spellEnd"/>
-      <w:r>
-        <w:rPr>
-          <w:b/>
-          <w:bCs/>
-          <w:sz w:val="32"/>
-          <w:szCs w:val="32"/>
-        </w:rPr>
-        <w:t xml:space="preserve">&lt;…&gt; </w:t>
-      </w:r>
-      <w:r>
-        <w:rPr>
-          <w:sz w:val="32"/>
-          <w:szCs w:val="32"/>
-        </w:rPr>
-        <w:t xml:space="preserve">call back method to listen to values directly from </w:t>
-      </w:r>
-      <w:proofErr w:type="spellStart"/>
-      <w:r>
-        <w:rPr>
-          <w:b/>
-          <w:bCs/>
-          <w:sz w:val="32"/>
-          <w:szCs w:val="32"/>
-        </w:rPr>
-        <w:t>StreamSubscription</w:t>
-      </w:r>
-      <w:proofErr w:type="spellEnd"/>
-      <w:r>
-        <w:rPr>
-          <w:sz w:val="32"/>
-          <w:szCs w:val="32"/>
-        </w:rPr>
-        <w:t xml:space="preserve"> from notifier class in UI</w:t>
-      </w:r>
-    </w:p>
-    <w:p>
-      <w:pPr>
-        <w:jc w:val="both"/>
-        <w:rPr>
-          <w:b/>
-          <w:bCs/>
-          <w:color w:val="D86DCB" w:themeColor="accent5" w:themeTint="99"/>
-          <w:sz w:val="32"/>
-          <w:szCs w:val="32"/>
-        </w:rPr>
-      </w:pPr>
-      <w:proofErr w:type="gramStart"/>
-      <w:r>
-        <w:rPr>
-          <w:b/>
-          <w:bCs/>
-          <w:color w:val="D86DCB" w:themeColor="accent5" w:themeTint="99"/>
-          <w:sz w:val="32"/>
-          <w:szCs w:val="32"/>
-        </w:rPr>
-        <w:t xml:space="preserve">void  </w:t>
-      </w:r>
-      <w:proofErr w:type="spellStart"/>
-      <w:r>
-        <w:rPr>
-          <w:b/>
-          <w:bCs/>
-          <w:color w:val="D86DCB" w:themeColor="accent5" w:themeTint="99"/>
-          <w:sz w:val="32"/>
-          <w:szCs w:val="32"/>
-        </w:rPr>
-        <w:t>listenStream</w:t>
-      </w:r>
-      <w:proofErr w:type="spellEnd"/>
-      <w:proofErr w:type="gramEnd"/>
-      <w:r>
-        <w:rPr>
-          <w:b/>
-          <w:bCs/>
-          <w:color w:val="D86DCB" w:themeColor="accent5" w:themeTint="99"/>
-          <w:sz w:val="32"/>
-          <w:szCs w:val="32"/>
-        </w:rPr>
-        <w:t>(</w:t>
-      </w:r>
-      <w:proofErr w:type="spellStart"/>
-      <w:r>
-        <w:rPr>
-          <w:b/>
-          <w:bCs/>
-          <w:color w:val="D86DCB" w:themeColor="accent5" w:themeTint="99"/>
-          <w:sz w:val="32"/>
-          <w:szCs w:val="32"/>
-        </w:rPr>
-        <w:t>ValueChanged</w:t>
-      </w:r>
-      <w:proofErr w:type="spellEnd"/>
-      <w:r>
-        <w:rPr>
-          <w:b/>
-          <w:bCs/>
-          <w:color w:val="D86DCB" w:themeColor="accent5" w:themeTint="99"/>
-          <w:sz w:val="32"/>
-          <w:szCs w:val="32"/>
-        </w:rPr>
-        <w:t xml:space="preserve">&lt;…&gt; </w:t>
-      </w:r>
-      <w:proofErr w:type="spellStart"/>
-      <w:r>
-        <w:rPr>
-          <w:b/>
-          <w:bCs/>
-          <w:color w:val="D86DCB" w:themeColor="accent5" w:themeTint="99"/>
-          <w:sz w:val="32"/>
-          <w:szCs w:val="32"/>
-        </w:rPr>
-        <w:t>onChanged</w:t>
-      </w:r>
-      <w:proofErr w:type="spellEnd"/>
-      <w:r>
-        <w:rPr>
-          <w:b/>
-          <w:bCs/>
-          <w:color w:val="D86DCB" w:themeColor="accent5" w:themeTint="99"/>
-          <w:sz w:val="32"/>
-          <w:szCs w:val="32"/>
-        </w:rPr>
-        <w:t>) {</w:t>
+        <w:t>().listen((position) {</w:t>
       </w:r>
     </w:p>
     <w:p>
@@ -35037,7 +36413,49 @@
           <w:sz w:val="32"/>
           <w:szCs w:val="32"/>
         </w:rPr>
-        <w:t>(value);</w:t>
+        <w:t>(</w:t>
+      </w:r>
+      <w:r>
+        <w:rPr>
+          <w:b/>
+          <w:bCs/>
+          <w:color w:val="D86DCB" w:themeColor="accent5" w:themeTint="99"/>
+          <w:sz w:val="32"/>
+          <w:szCs w:val="32"/>
+        </w:rPr>
+        <w:t>position</w:t>
+      </w:r>
+      <w:r>
+        <w:rPr>
+          <w:b/>
+          <w:bCs/>
+          <w:color w:val="D86DCB" w:themeColor="accent5" w:themeTint="99"/>
+          <w:sz w:val="32"/>
+          <w:szCs w:val="32"/>
+        </w:rPr>
+        <w:t>);</w:t>
+      </w:r>
+    </w:p>
+    <w:p>
+      <w:pPr>
+        <w:jc w:val="both"/>
+        <w:rPr>
+          <w:b/>
+          <w:bCs/>
+          <w:color w:val="D86DCB" w:themeColor="accent5" w:themeTint="99"/>
+          <w:sz w:val="32"/>
+          <w:szCs w:val="32"/>
+        </w:rPr>
+      </w:pPr>
+      <w:r>
+        <w:rPr>
+          <w:b/>
+          <w:bCs/>
+          <w:color w:val="D86DCB" w:themeColor="accent5" w:themeTint="99"/>
+          <w:sz w:val="32"/>
+          <w:szCs w:val="32"/>
+        </w:rPr>
+        <w:t xml:space="preserve">    });</w:t>
       </w:r>
     </w:p>
     <w:p>
@@ -35095,16 +36513,127 @@
           <w:szCs w:val="32"/>
         </w:rPr>
       </w:pPr>
-      <w:proofErr w:type="spellStart"/>
-      <w:r>
-        <w:rPr>
-          <w:b/>
-          <w:bCs/>
-          <w:color w:val="D86DCB" w:themeColor="accent5" w:themeTint="99"/>
-          <w:sz w:val="32"/>
-          <w:szCs w:val="32"/>
-        </w:rPr>
-        <w:lastRenderedPageBreak/>
+      <w:r>
+        <w:rPr>
+          <w:b/>
+          <w:bCs/>
+          <w:color w:val="D86DCB" w:themeColor="accent5" w:themeTint="99"/>
+          <w:sz w:val="32"/>
+          <w:szCs w:val="32"/>
+        </w:rPr>
+        <w:t xml:space="preserve">final </w:t>
+      </w:r>
+      <w:proofErr w:type="spellStart"/>
+      <w:r>
+        <w:rPr>
+          <w:b/>
+          <w:bCs/>
+          <w:color w:val="D86DCB" w:themeColor="accent5" w:themeTint="99"/>
+          <w:sz w:val="32"/>
+          <w:szCs w:val="32"/>
+        </w:rPr>
+        <w:t>notifierClass</w:t>
+      </w:r>
+      <w:proofErr w:type="spellEnd"/>
+      <w:r>
+        <w:rPr>
+          <w:b/>
+          <w:bCs/>
+          <w:color w:val="D86DCB" w:themeColor="accent5" w:themeTint="99"/>
+          <w:sz w:val="32"/>
+          <w:szCs w:val="32"/>
+        </w:rPr>
+        <w:t xml:space="preserve"> = </w:t>
+      </w:r>
+      <w:proofErr w:type="spellStart"/>
+      <w:proofErr w:type="gramStart"/>
+      <w:r>
+        <w:rPr>
+          <w:b/>
+          <w:bCs/>
+          <w:color w:val="D86DCB" w:themeColor="accent5" w:themeTint="99"/>
+          <w:sz w:val="32"/>
+          <w:szCs w:val="32"/>
+        </w:rPr>
+        <w:t>context.watch</w:t>
+      </w:r>
+      <w:proofErr w:type="spellEnd"/>
+      <w:proofErr w:type="gramEnd"/>
+      <w:r>
+        <w:rPr>
+          <w:b/>
+          <w:bCs/>
+          <w:color w:val="D86DCB" w:themeColor="accent5" w:themeTint="99"/>
+          <w:sz w:val="32"/>
+          <w:szCs w:val="32"/>
+        </w:rPr>
+        <w:t>&lt;</w:t>
+      </w:r>
+      <w:proofErr w:type="spellStart"/>
+      <w:r>
+        <w:rPr>
+          <w:b/>
+          <w:bCs/>
+          <w:color w:val="D86DCB" w:themeColor="accent5" w:themeTint="99"/>
+          <w:sz w:val="32"/>
+          <w:szCs w:val="32"/>
+        </w:rPr>
+        <w:t>LocationProvider</w:t>
+      </w:r>
+      <w:proofErr w:type="spellEnd"/>
+      <w:r>
+        <w:rPr>
+          <w:b/>
+          <w:bCs/>
+          <w:color w:val="D86DCB" w:themeColor="accent5" w:themeTint="99"/>
+          <w:sz w:val="32"/>
+          <w:szCs w:val="32"/>
+        </w:rPr>
+        <w:t>&gt;();</w:t>
+      </w:r>
+    </w:p>
+    <w:p>
+      <w:pPr>
+        <w:jc w:val="both"/>
+        <w:rPr>
+          <w:b/>
+          <w:bCs/>
+          <w:color w:val="D86DCB" w:themeColor="accent5" w:themeTint="99"/>
+          <w:sz w:val="32"/>
+          <w:szCs w:val="32"/>
+        </w:rPr>
+      </w:pPr>
+      <w:r>
+        <w:rPr>
+          <w:b/>
+          <w:bCs/>
+          <w:color w:val="D86DCB" w:themeColor="accent5" w:themeTint="99"/>
+          <w:sz w:val="32"/>
+          <w:szCs w:val="32"/>
+        </w:rPr>
+        <w:t>…</w:t>
+      </w:r>
+    </w:p>
+    <w:p>
+      <w:pPr>
+        <w:jc w:val="both"/>
+        <w:rPr>
+          <w:b/>
+          <w:bCs/>
+          <w:color w:val="D86DCB" w:themeColor="accent5" w:themeTint="99"/>
+          <w:sz w:val="32"/>
+          <w:szCs w:val="32"/>
+        </w:rPr>
+      </w:pPr>
+      <w:proofErr w:type="spellStart"/>
+      <w:r>
+        <w:rPr>
+          <w:b/>
+          <w:bCs/>
+          <w:color w:val="D86DCB" w:themeColor="accent5" w:themeTint="99"/>
+          <w:sz w:val="32"/>
+          <w:szCs w:val="32"/>
+        </w:rPr>
         <w:t>notifierClass.listenStream</w:t>
       </w:r>
       <w:proofErr w:type="spellEnd"/>

</xml_diff>